<commit_message>
G06 Code generation stuff
</commit_message>
<xml_diff>
--- a/homework-template.docx
+++ b/homework-template.docx
@@ -91,6 +91,40 @@
         <w:bidi w:val="0"/>
         <w:jc w:val="start"/>
         <w:rPr/>
+      </w:pPr>
+      <w:r>
+        <w:rPr/>
+      </w:r>
+    </w:p>
+    <w:p>
+      <w:pPr>
+        <w:pStyle w:val="Normal"/>
+        <w:rPr>
+          <w:b/>
+          <w:bCs/>
+          <w:sz w:val="28"/>
+          <w:szCs w:val="28"/>
+        </w:rPr>
+      </w:pPr>
+      <w:r>
+        <w:rPr>
+          <w:b/>
+          <w:bCs/>
+          <w:sz w:val="28"/>
+          <w:szCs w:val="28"/>
+        </w:rPr>
+        <w:t>FAU Email: __________________</w:t>
+      </w:r>
+    </w:p>
+    <w:p>
+      <w:pPr>
+        <w:pStyle w:val="Normal"/>
+        <w:bidi w:val="0"/>
+        <w:jc w:val="start"/>
+        <w:rPr>
+          <w:b/>
+          <w:bCs/>
+        </w:rPr>
       </w:pPr>
       <w:r>
         <w:rPr/>
@@ -636,7 +670,7 @@
     </w:r>
     <w:r>
       <w:rPr/>
-      <w:t>1</w:t>
+      <w:t>2</w:t>
     </w:r>
     <w:r>
       <w:rPr/>
@@ -670,7 +704,7 @@
     </w:r>
     <w:r>
       <w:rPr/>
-      <w:t>1</w:t>
+      <w:t>2</w:t>
     </w:r>
     <w:r>
       <w:rPr/>

</xml_diff>